<commit_message>
Pas de réponse cachée ni de phrase cassée ; reprise sûre des brouillons
- Les choix cliniques (classe, établissement, latéralité, mode de garde,
  entente, personne demandeuse, MDPH, accord des parents) commencent à
  « — à renseigner — » ; l'écran Bilan liste ceux qui restent vides.
- Une réponse vide donne un champ vide, et le modèle masque la phrase
  avec les conditions docxtemplater {#champ}…{/champ} : plus de « Dr , à
  . », « Motif : . » ni « () ».
- reprise.ts : brouillon versionné ; chaque réponse est vérifiée contre le
  questionnaire, celles qui n'existent plus sont retirées et signalées une
  fois, et le brouillon nettoyé est réenregistré aussitôt.

Co-Authored-By: Claude Opus 5.5 <noreply@anthropic.com>
Claude-Session: https://claude.ai/code/session_01V7EsS9N5TEqVojuyx6JiYq
</commit_message>
<xml_diff>
--- a/contenu/bilan.docx
+++ b/contenu/bilan.docx
@@ -2964,95 +2964,95 @@
       </w:pPr>
       <w:r>
         <w:lastRenderedPageBreak/>
-        <w:t xml:space="preserve">Je rencontre </w:t>
+        <w:t xml:space="preserve">Je rencontre {prenom}{#date_de_naissance} {ne_e} le {date_de_naissance}{/date_de_naissance}{#age}, {il_elle} a {age}{/age}. {#classe}{Il_Elle} est en {classe}{#type_etablissement} dans {type_etablissement}{/type_etablissement}{#nom_etablissement} {nom_etablissement}{/nom_etablissement}. {/classe}{#lateralite}{prenom} est {lateralite}. {/lateralite}{#mode_de_garde}{Il_Elle} vit {mode_de_garde}{#fratrie}, {il_elle} {fratrie}{#entente} {entente}{/entente}{/fratrie}. {/mode_de_garde}{^mode_de_garde}{#fratrie}{Il_Elle} {fratrie}{#entente} {entente}{/entente}. {/fratrie}{/mode_de_garde}{#medecin_traitant}Nom du médecin traitant : Dr {medecin_traitant}{#ville}, à {ville}{/ville}.{/medecin_traitant}</w:t>
       </w:r>
       <w:proofErr w:type="spellStart"/>
       <w:r>
-        <w:t xml:space="preserve">{prenom}</w:t>
+        <w:t xml:space="preserve"/>
       </w:r>
       <w:proofErr w:type="spellEnd"/>
       <w:r>
-        <w:t xml:space="preserve"> {ne_e}</w:t>
-      </w:r>
-      <w:r>
         <w:t xml:space="preserve"/>
       </w:r>
       <w:r>
-        <w:t xml:space="preserve"> le </w:t>
+        <w:t xml:space="preserve"/>
+      </w:r>
+      <w:r>
+        <w:t xml:space="preserve"/>
       </w:r>
       <w:proofErr w:type="spellStart"/>
       <w:r>
-        <w:t xml:space="preserve">{date_de_naissance}</w:t>
+        <w:t xml:space="preserve"/>
       </w:r>
       <w:proofErr w:type="spellEnd"/>
       <w:r>
-        <w:t xml:space="preserve">, </w:t>
-      </w:r>
-      <w:r>
-        <w:t xml:space="preserve">{il_elle}</w:t>
-      </w:r>
-      <w:r>
-        <w:t xml:space="preserve"> a </w:t>
+        <w:t xml:space="preserve"/>
+      </w:r>
+      <w:r>
+        <w:t xml:space="preserve"/>
+      </w:r>
+      <w:r>
+        <w:t xml:space="preserve"/>
       </w:r>
       <w:proofErr w:type="spellStart"/>
       <w:r>
-        <w:t xml:space="preserve">{age}</w:t>
+        <w:t xml:space="preserve"/>
       </w:r>
       <w:proofErr w:type="spellEnd"/>
       <w:r>
-        <w:t xml:space="preserve">. </w:t>
-      </w:r>
-      <w:r>
-        <w:t xml:space="preserve">{Il_Elle}</w:t>
-      </w:r>
-      <w:r>
-        <w:t xml:space="preserve"> est en </w:t>
+        <w:t xml:space="preserve"/>
+      </w:r>
+      <w:r>
+        <w:t xml:space="preserve"/>
+      </w:r>
+      <w:r>
+        <w:t xml:space="preserve"/>
       </w:r>
       <w:proofErr w:type="spellStart"/>
       <w:r>
-        <w:t xml:space="preserve">{classe}</w:t>
+        <w:t xml:space="preserve"/>
       </w:r>
       <w:proofErr w:type="spellEnd"/>
       <w:r>
-        <w:t xml:space="preserve"> dans </w:t>
+        <w:t xml:space="preserve"/>
       </w:r>
       <w:proofErr w:type="spellStart"/>
       <w:r>
-        <w:t xml:space="preserve">{type_etablissement}</w:t>
+        <w:t xml:space="preserve"/>
       </w:r>
       <w:proofErr w:type="spellEnd"/>
       <w:r>
-        <w:t xml:space="preserve"> </w:t>
+        <w:t xml:space="preserve"/>
       </w:r>
       <w:proofErr w:type="spellStart"/>
       <w:r>
-        <w:t xml:space="preserve">{nom_etablissement}</w:t>
+        <w:t xml:space="preserve"/>
       </w:r>
       <w:proofErr w:type="spellEnd"/>
       <w:r>
-        <w:t xml:space="preserve">. </w:t>
+        <w:t xml:space="preserve"/>
       </w:r>
       <w:proofErr w:type="spellStart"/>
       <w:r>
-        <w:t xml:space="preserve">{prenom}</w:t>
+        <w:t xml:space="preserve"/>
       </w:r>
       <w:proofErr w:type="spellEnd"/>
       <w:r>
-        <w:t xml:space="preserve"> est </w:t>
+        <w:t xml:space="preserve"/>
       </w:r>
       <w:proofErr w:type="spellStart"/>
       <w:r>
-        <w:t xml:space="preserve">{lateralite}</w:t>
+        <w:t xml:space="preserve"/>
       </w:r>
       <w:proofErr w:type="spellEnd"/>
       <w:r>
-        <w:t>.</w:t>
-      </w:r>
-      <w:r>
-        <w:t xml:space="preserve"> {Il_Elle} </w:t>
-      </w:r>
-      <w:r>
-        <w:t xml:space="preserve">vit {mode_de_garde}</w:t>
+        <w:t xml:space="preserve"/>
+      </w:r>
+      <w:r>
+        <w:t xml:space="preserve"/>
+      </w:r>
+      <w:r>
+        <w:t xml:space="preserve"/>
       </w:r>
       <w:proofErr w:type="spellStart"/>
       <w:r>
@@ -3060,45 +3060,45 @@
       </w:r>
       <w:proofErr w:type="spellEnd"/>
       <w:r>
-        <w:t>,</w:t>
-      </w:r>
-      <w:r>
-        <w:t xml:space="preserve"> {il_elle}</w:t>
-      </w:r>
-      <w:r>
-        <w:t xml:space="preserve"> </w:t>
+        <w:t xml:space="preserve"/>
+      </w:r>
+      <w:r>
+        <w:t xml:space="preserve"/>
+      </w:r>
+      <w:r>
+        <w:t xml:space="preserve"/>
       </w:r>
       <w:proofErr w:type="spellStart"/>
       <w:r>
-        <w:t xml:space="preserve">{fratrie}</w:t>
+        <w:t xml:space="preserve"/>
       </w:r>
       <w:proofErr w:type="spellEnd"/>
       <w:r>
-        <w:t xml:space="preserve"> </w:t>
+        <w:t xml:space="preserve"/>
       </w:r>
       <w:proofErr w:type="spellStart"/>
       <w:r>
-        <w:t xml:space="preserve">{entente}</w:t>
+        <w:t xml:space="preserve"/>
       </w:r>
       <w:proofErr w:type="spellEnd"/>
       <w:r>
-        <w:t xml:space="preserve">. Nom du médecin traitant : Dr </w:t>
+        <w:t xml:space="preserve"/>
       </w:r>
       <w:proofErr w:type="spellStart"/>
       <w:r>
-        <w:t xml:space="preserve">{medecin_traitant}</w:t>
+        <w:t xml:space="preserve"/>
       </w:r>
       <w:proofErr w:type="spellEnd"/>
       <w:r>
-        <w:t xml:space="preserve">, à </w:t>
+        <w:t xml:space="preserve"/>
       </w:r>
       <w:proofErr w:type="spellStart"/>
       <w:r>
-        <w:t xml:space="preserve">{ville}</w:t>
+        <w:t xml:space="preserve"/>
       </w:r>
       <w:proofErr w:type="spellEnd"/>
       <w:r>
-        <w:t xml:space="preserve"> .</w:t>
+        <w:t xml:space="preserve"/>
       </w:r>
     </w:p>
     <w:p>
@@ -3193,7 +3193,7 @@
           <w:rFonts w:asciiTheme="minorHAnsi" w:hAnsiTheme="minorHAnsi" w:cstheme="minorHAnsi"/>
           <w:color w:val="000000"/>
         </w:rPr>
-        <w:t xml:space="preserve">  le bilan a été demandé par </w:t>
+        <w:t xml:space="preserve">  {#personne_demandeuse}le bilan a été demandé par {personne_demandeuse}.{/personne_demandeuse}</w:t>
       </w:r>
       <w:proofErr w:type="spellStart"/>
       <w:r>
@@ -3201,7 +3201,7 @@
           <w:rFonts w:asciiTheme="minorHAnsi" w:hAnsiTheme="minorHAnsi" w:cstheme="minorHAnsi"/>
           <w:color w:val="000000"/>
         </w:rPr>
-        <w:t xml:space="preserve">{personne_demandeuse}</w:t>
+        <w:t xml:space="preserve"/>
       </w:r>
       <w:proofErr w:type="spellEnd"/>
       <w:r>
@@ -3209,7 +3209,7 @@
           <w:rFonts w:asciiTheme="minorHAnsi" w:hAnsiTheme="minorHAnsi" w:cstheme="minorHAnsi"/>
           <w:color w:val="000000"/>
         </w:rPr>
-        <w:t>.</w:t>
+        <w:t xml:space="preserve"/>
       </w:r>
     </w:p>
     <w:p>
@@ -3263,7 +3263,7 @@
           <w:sz w:val="22"/>
           <w:szCs w:val="22"/>
         </w:rPr>
-        <w:t xml:space="preserve">. </w:t>
+        <w:t xml:space="preserve">{#motifs}.{/motifs} </w:t>
       </w:r>
     </w:p>
     <w:p>

</xml_diff>

<commit_message>
Écran d'accueil, historique des bilans et réponses obligatoires
- Accueil : nouveau bilan, reprendre le bilan en cours, historique.
- Historique des bilans créés (recherche, ouverture, réévaluation,
  sauvegarde et import en .json).
- On ne passe à l'écran suivant qu'avec ses réponses obligatoires.
- Modèle Word allégé : plus aucune condition {#…}{/…}.
- Version 1.3.0.

Co-Authored-By: Claude Opus 5.5 (1M context) <noreply@anthropic.com>
Claude-Session: https://claude.ai/code/session_01H8jyBRdmFPUfXtNtfH5Fjz
</commit_message>
<xml_diff>
--- a/contenu/bilan.docx
+++ b/contenu/bilan.docx
@@ -2964,141 +2964,7 @@
       </w:pPr>
       <w:r>
         <w:lastRenderedPageBreak/>
-        <w:t xml:space="preserve">Je rencontre {prenom}{#date_de_naissance} {ne_e} le {date_de_naissance}{/date_de_naissance}{#age}, {il_elle} a {age}{/age}. {#classe}{Il_Elle} est en {classe}{#type_etablissement} dans {type_etablissement}{/type_etablissement}{#nom_etablissement} {nom_etablissement}{/nom_etablissement}. {/classe}{#lateralite}{prenom} est {lateralite}. {/lateralite}{#mode_de_garde}{Il_Elle} vit {mode_de_garde}{#fratrie}, {il_elle} {fratrie}{#entente} {entente}{/entente}{/fratrie}. {/mode_de_garde}{^mode_de_garde}{#fratrie}{Il_Elle} {fratrie}{#entente} {entente}{/entente}. {/fratrie}{/mode_de_garde}{#medecin_traitant}Nom du médecin traitant : Dr {medecin_traitant}{#ville}, à {ville}{/ville}.{/medecin_traitant}</w:t>
-      </w:r>
-      <w:proofErr w:type="spellStart"/>
-      <w:r>
-        <w:t xml:space="preserve"/>
-      </w:r>
-      <w:proofErr w:type="spellEnd"/>
-      <w:r>
-        <w:t xml:space="preserve"/>
-      </w:r>
-      <w:r>
-        <w:t xml:space="preserve"/>
-      </w:r>
-      <w:r>
-        <w:t xml:space="preserve"/>
-      </w:r>
-      <w:proofErr w:type="spellStart"/>
-      <w:r>
-        <w:t xml:space="preserve"/>
-      </w:r>
-      <w:proofErr w:type="spellEnd"/>
-      <w:r>
-        <w:t xml:space="preserve"/>
-      </w:r>
-      <w:r>
-        <w:t xml:space="preserve"/>
-      </w:r>
-      <w:r>
-        <w:t xml:space="preserve"/>
-      </w:r>
-      <w:proofErr w:type="spellStart"/>
-      <w:r>
-        <w:t xml:space="preserve"/>
-      </w:r>
-      <w:proofErr w:type="spellEnd"/>
-      <w:r>
-        <w:t xml:space="preserve"/>
-      </w:r>
-      <w:r>
-        <w:t xml:space="preserve"/>
-      </w:r>
-      <w:r>
-        <w:t xml:space="preserve"/>
-      </w:r>
-      <w:proofErr w:type="spellStart"/>
-      <w:r>
-        <w:t xml:space="preserve"/>
-      </w:r>
-      <w:proofErr w:type="spellEnd"/>
-      <w:r>
-        <w:t xml:space="preserve"/>
-      </w:r>
-      <w:proofErr w:type="spellStart"/>
-      <w:r>
-        <w:t xml:space="preserve"/>
-      </w:r>
-      <w:proofErr w:type="spellEnd"/>
-      <w:r>
-        <w:t xml:space="preserve"/>
-      </w:r>
-      <w:proofErr w:type="spellStart"/>
-      <w:r>
-        <w:t xml:space="preserve"/>
-      </w:r>
-      <w:proofErr w:type="spellEnd"/>
-      <w:r>
-        <w:t xml:space="preserve"/>
-      </w:r>
-      <w:proofErr w:type="spellStart"/>
-      <w:r>
-        <w:t xml:space="preserve"/>
-      </w:r>
-      <w:proofErr w:type="spellEnd"/>
-      <w:r>
-        <w:t xml:space="preserve"/>
-      </w:r>
-      <w:proofErr w:type="spellStart"/>
-      <w:r>
-        <w:t xml:space="preserve"/>
-      </w:r>
-      <w:proofErr w:type="spellEnd"/>
-      <w:r>
-        <w:t xml:space="preserve"/>
-      </w:r>
-      <w:r>
-        <w:t xml:space="preserve"/>
-      </w:r>
-      <w:r>
-        <w:t xml:space="preserve"/>
-      </w:r>
-      <w:proofErr w:type="spellStart"/>
-      <w:r>
-        <w:t xml:space="preserve"/>
-      </w:r>
-      <w:proofErr w:type="spellEnd"/>
-      <w:r>
-        <w:t xml:space="preserve"/>
-      </w:r>
-      <w:r>
-        <w:t xml:space="preserve"/>
-      </w:r>
-      <w:r>
-        <w:t xml:space="preserve"/>
-      </w:r>
-      <w:proofErr w:type="spellStart"/>
-      <w:r>
-        <w:t xml:space="preserve"/>
-      </w:r>
-      <w:proofErr w:type="spellEnd"/>
-      <w:r>
-        <w:t xml:space="preserve"/>
-      </w:r>
-      <w:proofErr w:type="spellStart"/>
-      <w:r>
-        <w:t xml:space="preserve"/>
-      </w:r>
-      <w:proofErr w:type="spellEnd"/>
-      <w:r>
-        <w:t xml:space="preserve"/>
-      </w:r>
-      <w:proofErr w:type="spellStart"/>
-      <w:r>
-        <w:t xml:space="preserve"/>
-      </w:r>
-      <w:proofErr w:type="spellEnd"/>
-      <w:r>
-        <w:t xml:space="preserve"/>
-      </w:r>
-      <w:proofErr w:type="spellStart"/>
-      <w:r>
-        <w:t xml:space="preserve"/>
-      </w:r>
-      <w:proofErr w:type="spellEnd"/>
-      <w:r>
-        <w:t xml:space="preserve"/>
+        <w:t xml:space="preserve">Je rencontre {prenom} {ne_e} le {date_de_naissance}, {il_elle} a {age}. {Il_Elle} est en {classe} dans {type_etablissement} {nom_etablissement}. {prenom} est {lateralite}. {Il_Elle} vit {mode_de_garde}, {il_elle} {fratrie}. Nom du médecin traitant : Dr {medecin_traitant}, à {ville}.</w:t>
       </w:r>
     </w:p>
     <w:p>
@@ -3193,7 +3059,7 @@
           <w:rFonts w:asciiTheme="minorHAnsi" w:hAnsiTheme="minorHAnsi" w:cstheme="minorHAnsi"/>
           <w:color w:val="000000"/>
         </w:rPr>
-        <w:t xml:space="preserve">  {#personne_demandeuse}le bilan a été demandé par {personne_demandeuse}.{/personne_demandeuse}</w:t>
+        <w:t xml:space="preserve"> le bilan a été demandé par {personne_demandeuse}.</w:t>
       </w:r>
       <w:proofErr w:type="spellStart"/>
       <w:r>
@@ -3263,7 +3129,7 @@
           <w:sz w:val="22"/>
           <w:szCs w:val="22"/>
         </w:rPr>
-        <w:t xml:space="preserve">{#motifs}.{/motifs} </w:t>
+        <w:t xml:space="preserve">.</w:t>
       </w:r>
     </w:p>
     <w:p>

</xml_diff>

<commit_message>
Carte nouvel onglet appelé caractère du patient (22e27d62-42ee-44e8-abbc-1f5a107d652e)
</commit_message>
<xml_diff>
--- a/contenu/bilan.docx
+++ b/contenu/bilan.docx
@@ -4370,6 +4370,137 @@
           <w:rtl w:val="0"/>
         </w:rPr>
       </w:r>
+    </w:p>
+    <w:p>
+      <w:pPr>
+        <w:pStyle w:val="Paragraphedeliste"/>
+        <w:numPr>
+          <w:ilvl w:val="0"/>
+          <w:numId w:val="11"/>
+        </w:numPr>
+        <w:pBdr>
+          <w:top w:val="nil"/>
+          <w:left w:val="nil"/>
+          <w:bottom w:val="nil"/>
+          <w:right w:val="nil"/>
+          <w:between w:val="nil"/>
+        </w:pBdr>
+        <w:rPr>
+          <w:rFonts w:asciiTheme="minorHAnsi" w:hAnsiTheme="minorHAnsi" w:cstheme="minorHAnsi"/>
+          <w:color w:val="000000"/>
+          <w:sz w:val="22"/>
+          <w:szCs w:val="22"/>
+        </w:rPr>
+      </w:pPr>
+      <w:r>
+        <w:rPr>
+          <w:rFonts w:asciiTheme="minorHAnsi" w:hAnsiTheme="minorHAnsi" w:cstheme="minorHAnsi"/>
+          <w:b/>
+          <w:color w:val="000000"/>
+          <w:sz w:val="22"/>
+          <w:szCs w:val="22"/>
+        </w:rPr>
+        <w:t>Comportement de l’enfant de manière générale</w:t>
+      </w:r>
+      <w:r>
+        <w:rPr>
+          <w:rFonts w:asciiTheme="minorHAnsi" w:hAnsiTheme="minorHAnsi" w:cstheme="minorHAnsi"/>
+          <w:color w:val="000000"/>
+          <w:sz w:val="22"/>
+          <w:szCs w:val="22"/>
+        </w:rPr>
+        <w:t xml:space="preserve"> : </w:t>
+      </w:r>
+      <w:proofErr w:type="spellStart"/>
+      <w:r>
+        <w:rPr>
+          <w:rFonts w:asciiTheme="minorHAnsi" w:hAnsiTheme="minorHAnsi" w:cstheme="minorHAnsi"/>
+          <w:color w:val="000000"/>
+          <w:sz w:val="22"/>
+          <w:szCs w:val="22"/>
+        </w:rPr>
+        <w:t xml:space="preserve"/>
+      </w:r>
+      <w:proofErr w:type="spellEnd"/>
+    </w:p>
+    <w:p>
+      <w:pPr>
+        <w:pStyle w:val="Paragraphedeliste"/>
+        <w:pBdr>
+          <w:top w:val="nil"/>
+          <w:left w:val="nil"/>
+          <w:bottom w:val="nil"/>
+          <w:right w:val="nil"/>
+          <w:between w:val="nil"/>
+        </w:pBdr>
+        <w:jc w:val="left"/>
+        <w:rPr>
+          <w:rFonts w:asciiTheme="minorHAnsi" w:hAnsiTheme="minorHAnsi" w:cstheme="minorHAnsi"/>
+          <w:color w:val="000000"/>
+          <w:sz w:val="22"/>
+          <w:szCs w:val="22"/>
+        </w:rPr>
+      </w:pPr>
+      <w:proofErr w:type="spellStart"/>
+      <w:r>
+        <w:rPr>
+          <w:rFonts w:asciiTheme="minorHAnsi" w:hAnsiTheme="minorHAnsi" w:cstheme="minorHAnsi"/>
+          <w:color w:val="000000"/>
+          <w:sz w:val="22"/>
+          <w:szCs w:val="22"/>
+        </w:rPr>
+        <w:t xml:space="preserve">{caractere_parents}</w:t>
+      </w:r>
+      <w:proofErr w:type="spellEnd"/>
+    </w:p>
+    <w:p>
+      <w:pPr>
+        <w:pStyle w:val="Paragraphedeliste"/>
+        <w:pBdr>
+          <w:top w:val="nil"/>
+          <w:left w:val="nil"/>
+          <w:bottom w:val="nil"/>
+          <w:right w:val="nil"/>
+          <w:between w:val="nil"/>
+        </w:pBdr>
+        <w:jc w:val="left"/>
+        <w:rPr>
+          <w:rFonts w:asciiTheme="minorHAnsi" w:hAnsiTheme="minorHAnsi" w:cstheme="minorHAnsi"/>
+          <w:color w:val="000000"/>
+          <w:sz w:val="22"/>
+          <w:szCs w:val="22"/>
+        </w:rPr>
+      </w:pPr>
+      <w:proofErr w:type="spellStart"/>
+      <w:r>
+        <w:rPr>
+          <w:rFonts w:asciiTheme="minorHAnsi" w:hAnsiTheme="minorHAnsi" w:cstheme="minorHAnsi"/>
+          <w:color w:val="000000"/>
+          <w:sz w:val="22"/>
+          <w:szCs w:val="22"/>
+        </w:rPr>
+        <w:t xml:space="preserve">{caractere_enfant}</w:t>
+      </w:r>
+      <w:proofErr w:type="spellEnd"/>
+    </w:p>
+    <w:p>
+      <w:pPr>
+        <w:pStyle w:val="Paragraphedeliste"/>
+        <w:pBdr>
+          <w:top w:val="nil"/>
+          <w:left w:val="nil"/>
+          <w:bottom w:val="nil"/>
+          <w:right w:val="nil"/>
+          <w:between w:val="nil"/>
+        </w:pBdr>
+        <w:ind w:left="360"/>
+        <w:rPr>
+          <w:rFonts w:asciiTheme="minorHAnsi" w:hAnsiTheme="minorHAnsi" w:cstheme="minorHAnsi"/>
+          <w:color w:val="000000"/>
+          <w:sz w:val="12"/>
+          <w:szCs w:val="12"/>
+        </w:rPr>
+      </w:pPr>
     </w:p>
     <w:p>
       <w:pPr>

</xml_diff>

<commit_message>
Carte nouvel onglet appelé caractère du patient (22e27d62-42ee-44e8-abbc-1f5a107d652e) (#20)
Co-authored-by: PlaniFiKateur IA <agent@planifikateur.invalid>
</commit_message>
<xml_diff>
--- a/contenu/bilan.docx
+++ b/contenu/bilan.docx
@@ -4370,6 +4370,137 @@
           <w:rtl w:val="0"/>
         </w:rPr>
       </w:r>
+    </w:p>
+    <w:p>
+      <w:pPr>
+        <w:pStyle w:val="Paragraphedeliste"/>
+        <w:numPr>
+          <w:ilvl w:val="0"/>
+          <w:numId w:val="11"/>
+        </w:numPr>
+        <w:pBdr>
+          <w:top w:val="nil"/>
+          <w:left w:val="nil"/>
+          <w:bottom w:val="nil"/>
+          <w:right w:val="nil"/>
+          <w:between w:val="nil"/>
+        </w:pBdr>
+        <w:rPr>
+          <w:rFonts w:asciiTheme="minorHAnsi" w:hAnsiTheme="minorHAnsi" w:cstheme="minorHAnsi"/>
+          <w:color w:val="000000"/>
+          <w:sz w:val="22"/>
+          <w:szCs w:val="22"/>
+        </w:rPr>
+      </w:pPr>
+      <w:r>
+        <w:rPr>
+          <w:rFonts w:asciiTheme="minorHAnsi" w:hAnsiTheme="minorHAnsi" w:cstheme="minorHAnsi"/>
+          <w:b/>
+          <w:color w:val="000000"/>
+          <w:sz w:val="22"/>
+          <w:szCs w:val="22"/>
+        </w:rPr>
+        <w:t>Comportement de l’enfant de manière générale</w:t>
+      </w:r>
+      <w:r>
+        <w:rPr>
+          <w:rFonts w:asciiTheme="minorHAnsi" w:hAnsiTheme="minorHAnsi" w:cstheme="minorHAnsi"/>
+          <w:color w:val="000000"/>
+          <w:sz w:val="22"/>
+          <w:szCs w:val="22"/>
+        </w:rPr>
+        <w:t xml:space="preserve"> : </w:t>
+      </w:r>
+      <w:proofErr w:type="spellStart"/>
+      <w:r>
+        <w:rPr>
+          <w:rFonts w:asciiTheme="minorHAnsi" w:hAnsiTheme="minorHAnsi" w:cstheme="minorHAnsi"/>
+          <w:color w:val="000000"/>
+          <w:sz w:val="22"/>
+          <w:szCs w:val="22"/>
+        </w:rPr>
+        <w:t xml:space="preserve"/>
+      </w:r>
+      <w:proofErr w:type="spellEnd"/>
+    </w:p>
+    <w:p>
+      <w:pPr>
+        <w:pStyle w:val="Paragraphedeliste"/>
+        <w:pBdr>
+          <w:top w:val="nil"/>
+          <w:left w:val="nil"/>
+          <w:bottom w:val="nil"/>
+          <w:right w:val="nil"/>
+          <w:between w:val="nil"/>
+        </w:pBdr>
+        <w:jc w:val="left"/>
+        <w:rPr>
+          <w:rFonts w:asciiTheme="minorHAnsi" w:hAnsiTheme="minorHAnsi" w:cstheme="minorHAnsi"/>
+          <w:color w:val="000000"/>
+          <w:sz w:val="22"/>
+          <w:szCs w:val="22"/>
+        </w:rPr>
+      </w:pPr>
+      <w:proofErr w:type="spellStart"/>
+      <w:r>
+        <w:rPr>
+          <w:rFonts w:asciiTheme="minorHAnsi" w:hAnsiTheme="minorHAnsi" w:cstheme="minorHAnsi"/>
+          <w:color w:val="000000"/>
+          <w:sz w:val="22"/>
+          <w:szCs w:val="22"/>
+        </w:rPr>
+        <w:t xml:space="preserve">{caractere_parents}</w:t>
+      </w:r>
+      <w:proofErr w:type="spellEnd"/>
+    </w:p>
+    <w:p>
+      <w:pPr>
+        <w:pStyle w:val="Paragraphedeliste"/>
+        <w:pBdr>
+          <w:top w:val="nil"/>
+          <w:left w:val="nil"/>
+          <w:bottom w:val="nil"/>
+          <w:right w:val="nil"/>
+          <w:between w:val="nil"/>
+        </w:pBdr>
+        <w:jc w:val="left"/>
+        <w:rPr>
+          <w:rFonts w:asciiTheme="minorHAnsi" w:hAnsiTheme="minorHAnsi" w:cstheme="minorHAnsi"/>
+          <w:color w:val="000000"/>
+          <w:sz w:val="22"/>
+          <w:szCs w:val="22"/>
+        </w:rPr>
+      </w:pPr>
+      <w:proofErr w:type="spellStart"/>
+      <w:r>
+        <w:rPr>
+          <w:rFonts w:asciiTheme="minorHAnsi" w:hAnsiTheme="minorHAnsi" w:cstheme="minorHAnsi"/>
+          <w:color w:val="000000"/>
+          <w:sz w:val="22"/>
+          <w:szCs w:val="22"/>
+        </w:rPr>
+        <w:t xml:space="preserve">{caractere_enfant}</w:t>
+      </w:r>
+      <w:proofErr w:type="spellEnd"/>
+    </w:p>
+    <w:p>
+      <w:pPr>
+        <w:pStyle w:val="Paragraphedeliste"/>
+        <w:pBdr>
+          <w:top w:val="nil"/>
+          <w:left w:val="nil"/>
+          <w:bottom w:val="nil"/>
+          <w:right w:val="nil"/>
+          <w:between w:val="nil"/>
+        </w:pBdr>
+        <w:ind w:left="360"/>
+        <w:rPr>
+          <w:rFonts w:asciiTheme="minorHAnsi" w:hAnsiTheme="minorHAnsi" w:cstheme="minorHAnsi"/>
+          <w:color w:val="000000"/>
+          <w:sz w:val="12"/>
+          <w:szCs w:val="12"/>
+        </w:rPr>
+      </w:pPr>
     </w:p>
     <w:p>
       <w:pPr>

</xml_diff>